<commit_message>
Doksi frissitése képek az oldalrol és a trellorol
</commit_message>
<xml_diff>
--- a/doc/FotStats.docx
+++ b/doc/FotStats.docx
@@ -1651,8 +1651,6 @@
         </w:rPr>
         <w:t xml:space="preserve"> megjelenítése(góllövőlista)</w:t>
       </w:r>
-      <w:bookmarkStart w:id="0" w:name="_GoBack"/>
-      <w:bookmarkEnd w:id="0"/>
     </w:p>
     <w:p>
       <w:pPr>
@@ -2047,6 +2045,1100 @@
           </wp:inline>
         </w:drawing>
       </w:r>
+      <w:r>
+        <w:rPr>
+          <w:b/>
+          <w:sz w:val="28"/>
+          <w:szCs w:val="28"/>
+        </w:rPr>
+        <w:br/>
+      </w:r>
+    </w:p>
+    <w:p>
+      <w:pPr>
+        <w:rPr>
+          <w:b/>
+          <w:sz w:val="28"/>
+          <w:szCs w:val="28"/>
+        </w:rPr>
+      </w:pPr>
+      <w:proofErr w:type="spellStart"/>
+      <w:proofErr w:type="gramStart"/>
+      <w:r>
+        <w:rPr>
+          <w:b/>
+          <w:sz w:val="28"/>
+          <w:szCs w:val="28"/>
+        </w:rPr>
+        <w:t>Trello</w:t>
+      </w:r>
+      <w:proofErr w:type="spellEnd"/>
+      <w:r>
+        <w:rPr>
+          <w:b/>
+          <w:sz w:val="28"/>
+          <w:szCs w:val="28"/>
+        </w:rPr>
+        <w:t>(</w:t>
+      </w:r>
+      <w:proofErr w:type="gramEnd"/>
+      <w:r>
+        <w:rPr>
+          <w:b/>
+          <w:sz w:val="28"/>
+          <w:szCs w:val="28"/>
+        </w:rPr>
+        <w:t>2026.01.13):</w:t>
+      </w:r>
+    </w:p>
+    <w:p>
+      <w:pPr>
+        <w:rPr>
+          <w:b/>
+          <w:sz w:val="28"/>
+          <w:szCs w:val="28"/>
+        </w:rPr>
+      </w:pPr>
+      <w:r>
+        <w:rPr>
+          <w:b/>
+          <w:sz w:val="28"/>
+          <w:szCs w:val="28"/>
+        </w:rPr>
+        <w:t>1.kép</w:t>
+      </w:r>
+    </w:p>
+    <w:p>
+      <w:pPr>
+        <w:rPr>
+          <w:b/>
+          <w:sz w:val="28"/>
+          <w:szCs w:val="28"/>
+        </w:rPr>
+      </w:pPr>
+      <w:r>
+        <w:rPr>
+          <w:b/>
+          <w:noProof/>
+          <w:sz w:val="28"/>
+          <w:szCs w:val="28"/>
+        </w:rPr>
+        <w:drawing>
+          <wp:inline distT="0" distB="0" distL="0" distR="0">
+            <wp:extent cx="5753100" cy="3200400"/>
+            <wp:effectExtent l="0" t="0" r="0" b="0"/>
+            <wp:docPr id="3" name="Kép 3"/>
+            <wp:cNvGraphicFramePr>
+              <a:graphicFrameLocks xmlns:a="http://schemas.openxmlformats.org/drawingml/2006/main" noChangeAspect="1"/>
+            </wp:cNvGraphicFramePr>
+            <a:graphic xmlns:a="http://schemas.openxmlformats.org/drawingml/2006/main">
+              <a:graphicData uri="http://schemas.openxmlformats.org/drawingml/2006/picture">
+                <pic:pic xmlns:pic="http://schemas.openxmlformats.org/drawingml/2006/picture">
+                  <pic:nvPicPr>
+                    <pic:cNvPr id="0" name="Picture 1"/>
+                    <pic:cNvPicPr>
+                      <a:picLocks noChangeAspect="1" noChangeArrowheads="1"/>
+                    </pic:cNvPicPr>
+                  </pic:nvPicPr>
+                  <pic:blipFill>
+                    <a:blip r:embed="rId7" cstate="print">
+                      <a:extLst>
+                        <a:ext uri="{28A0092B-C50C-407E-A947-70E740481C1C}">
+                          <a14:useLocalDpi xmlns:a14="http://schemas.microsoft.com/office/drawing/2010/main" val="0"/>
+                        </a:ext>
+                      </a:extLst>
+                    </a:blip>
+                    <a:srcRect/>
+                    <a:stretch>
+                      <a:fillRect/>
+                    </a:stretch>
+                  </pic:blipFill>
+                  <pic:spPr bwMode="auto">
+                    <a:xfrm>
+                      <a:off x="0" y="0"/>
+                      <a:ext cx="5753100" cy="3200400"/>
+                    </a:xfrm>
+                    <a:prstGeom prst="rect">
+                      <a:avLst/>
+                    </a:prstGeom>
+                    <a:noFill/>
+                    <a:ln>
+                      <a:noFill/>
+                    </a:ln>
+                  </pic:spPr>
+                </pic:pic>
+              </a:graphicData>
+            </a:graphic>
+          </wp:inline>
+        </w:drawing>
+      </w:r>
+    </w:p>
+    <w:p>
+      <w:pPr>
+        <w:rPr>
+          <w:b/>
+          <w:sz w:val="28"/>
+          <w:szCs w:val="28"/>
+        </w:rPr>
+      </w:pPr>
+    </w:p>
+    <w:p>
+      <w:pPr>
+        <w:rPr>
+          <w:b/>
+          <w:sz w:val="28"/>
+          <w:szCs w:val="28"/>
+        </w:rPr>
+      </w:pPr>
+    </w:p>
+    <w:p>
+      <w:pPr>
+        <w:rPr>
+          <w:b/>
+          <w:sz w:val="28"/>
+          <w:szCs w:val="28"/>
+        </w:rPr>
+      </w:pPr>
+    </w:p>
+    <w:p>
+      <w:pPr>
+        <w:rPr>
+          <w:b/>
+          <w:sz w:val="28"/>
+          <w:szCs w:val="28"/>
+        </w:rPr>
+      </w:pPr>
+    </w:p>
+    <w:p>
+      <w:pPr>
+        <w:rPr>
+          <w:b/>
+          <w:sz w:val="28"/>
+          <w:szCs w:val="28"/>
+        </w:rPr>
+      </w:pPr>
+    </w:p>
+    <w:p>
+      <w:pPr>
+        <w:rPr>
+          <w:b/>
+          <w:sz w:val="28"/>
+          <w:szCs w:val="28"/>
+        </w:rPr>
+      </w:pPr>
+      <w:r>
+        <w:rPr>
+          <w:b/>
+          <w:sz w:val="28"/>
+          <w:szCs w:val="28"/>
+        </w:rPr>
+        <w:lastRenderedPageBreak/>
+        <w:t>2.kép:</w:t>
+      </w:r>
+    </w:p>
+    <w:p>
+      <w:pPr>
+        <w:rPr>
+          <w:b/>
+          <w:sz w:val="28"/>
+          <w:szCs w:val="28"/>
+        </w:rPr>
+      </w:pPr>
+      <w:r>
+        <w:rPr>
+          <w:b/>
+          <w:noProof/>
+          <w:sz w:val="28"/>
+          <w:szCs w:val="28"/>
+        </w:rPr>
+        <w:drawing>
+          <wp:inline distT="0" distB="0" distL="0" distR="0">
+            <wp:extent cx="5753100" cy="3181350"/>
+            <wp:effectExtent l="0" t="0" r="0" b="0"/>
+            <wp:docPr id="4" name="Kép 4"/>
+            <wp:cNvGraphicFramePr>
+              <a:graphicFrameLocks xmlns:a="http://schemas.openxmlformats.org/drawingml/2006/main" noChangeAspect="1"/>
+            </wp:cNvGraphicFramePr>
+            <a:graphic xmlns:a="http://schemas.openxmlformats.org/drawingml/2006/main">
+              <a:graphicData uri="http://schemas.openxmlformats.org/drawingml/2006/picture">
+                <pic:pic xmlns:pic="http://schemas.openxmlformats.org/drawingml/2006/picture">
+                  <pic:nvPicPr>
+                    <pic:cNvPr id="0" name="Picture 2"/>
+                    <pic:cNvPicPr>
+                      <a:picLocks noChangeAspect="1" noChangeArrowheads="1"/>
+                    </pic:cNvPicPr>
+                  </pic:nvPicPr>
+                  <pic:blipFill>
+                    <a:blip r:embed="rId8" cstate="print">
+                      <a:extLst>
+                        <a:ext uri="{28A0092B-C50C-407E-A947-70E740481C1C}">
+                          <a14:useLocalDpi xmlns:a14="http://schemas.microsoft.com/office/drawing/2010/main" val="0"/>
+                        </a:ext>
+                      </a:extLst>
+                    </a:blip>
+                    <a:srcRect/>
+                    <a:stretch>
+                      <a:fillRect/>
+                    </a:stretch>
+                  </pic:blipFill>
+                  <pic:spPr bwMode="auto">
+                    <a:xfrm>
+                      <a:off x="0" y="0"/>
+                      <a:ext cx="5753100" cy="3181350"/>
+                    </a:xfrm>
+                    <a:prstGeom prst="rect">
+                      <a:avLst/>
+                    </a:prstGeom>
+                    <a:noFill/>
+                    <a:ln>
+                      <a:noFill/>
+                    </a:ln>
+                  </pic:spPr>
+                </pic:pic>
+              </a:graphicData>
+            </a:graphic>
+          </wp:inline>
+        </w:drawing>
+      </w:r>
+    </w:p>
+    <w:p>
+      <w:pPr>
+        <w:rPr>
+          <w:b/>
+          <w:sz w:val="28"/>
+          <w:szCs w:val="28"/>
+        </w:rPr>
+      </w:pPr>
+    </w:p>
+    <w:p>
+      <w:pPr>
+        <w:rPr>
+          <w:b/>
+          <w:sz w:val="28"/>
+          <w:szCs w:val="28"/>
+        </w:rPr>
+      </w:pPr>
+      <w:r>
+        <w:rPr>
+          <w:b/>
+          <w:sz w:val="28"/>
+          <w:szCs w:val="28"/>
+        </w:rPr>
+        <w:t>3.kép:</w:t>
+      </w:r>
+    </w:p>
+    <w:p>
+      <w:pPr>
+        <w:rPr>
+          <w:b/>
+          <w:sz w:val="28"/>
+          <w:szCs w:val="28"/>
+        </w:rPr>
+      </w:pPr>
+      <w:r>
+        <w:rPr>
+          <w:b/>
+          <w:noProof/>
+          <w:sz w:val="28"/>
+          <w:szCs w:val="28"/>
+        </w:rPr>
+        <w:drawing>
+          <wp:inline distT="0" distB="0" distL="0" distR="0">
+            <wp:extent cx="5743575" cy="2867025"/>
+            <wp:effectExtent l="0" t="0" r="9525" b="9525"/>
+            <wp:docPr id="5" name="Kép 5"/>
+            <wp:cNvGraphicFramePr>
+              <a:graphicFrameLocks xmlns:a="http://schemas.openxmlformats.org/drawingml/2006/main" noChangeAspect="1"/>
+            </wp:cNvGraphicFramePr>
+            <a:graphic xmlns:a="http://schemas.openxmlformats.org/drawingml/2006/main">
+              <a:graphicData uri="http://schemas.openxmlformats.org/drawingml/2006/picture">
+                <pic:pic xmlns:pic="http://schemas.openxmlformats.org/drawingml/2006/picture">
+                  <pic:nvPicPr>
+                    <pic:cNvPr id="0" name="Picture 3"/>
+                    <pic:cNvPicPr>
+                      <a:picLocks noChangeAspect="1" noChangeArrowheads="1"/>
+                    </pic:cNvPicPr>
+                  </pic:nvPicPr>
+                  <pic:blipFill>
+                    <a:blip r:embed="rId9" cstate="print">
+                      <a:extLst>
+                        <a:ext uri="{28A0092B-C50C-407E-A947-70E740481C1C}">
+                          <a14:useLocalDpi xmlns:a14="http://schemas.microsoft.com/office/drawing/2010/main" val="0"/>
+                        </a:ext>
+                      </a:extLst>
+                    </a:blip>
+                    <a:srcRect/>
+                    <a:stretch>
+                      <a:fillRect/>
+                    </a:stretch>
+                  </pic:blipFill>
+                  <pic:spPr bwMode="auto">
+                    <a:xfrm>
+                      <a:off x="0" y="0"/>
+                      <a:ext cx="5743575" cy="2867025"/>
+                    </a:xfrm>
+                    <a:prstGeom prst="rect">
+                      <a:avLst/>
+                    </a:prstGeom>
+                    <a:noFill/>
+                    <a:ln>
+                      <a:noFill/>
+                    </a:ln>
+                  </pic:spPr>
+                </pic:pic>
+              </a:graphicData>
+            </a:graphic>
+          </wp:inline>
+        </w:drawing>
+      </w:r>
+    </w:p>
+    <w:p>
+      <w:pPr>
+        <w:rPr>
+          <w:b/>
+          <w:sz w:val="28"/>
+          <w:szCs w:val="28"/>
+        </w:rPr>
+      </w:pPr>
+    </w:p>
+    <w:p>
+      <w:pPr>
+        <w:rPr>
+          <w:b/>
+          <w:sz w:val="28"/>
+          <w:szCs w:val="28"/>
+        </w:rPr>
+      </w:pPr>
+    </w:p>
+    <w:p>
+      <w:pPr>
+        <w:rPr>
+          <w:b/>
+          <w:sz w:val="28"/>
+          <w:szCs w:val="28"/>
+        </w:rPr>
+      </w:pPr>
+    </w:p>
+    <w:p>
+      <w:pPr>
+        <w:rPr>
+          <w:b/>
+          <w:sz w:val="28"/>
+          <w:szCs w:val="28"/>
+        </w:rPr>
+      </w:pPr>
+    </w:p>
+    <w:p>
+      <w:pPr>
+        <w:rPr>
+          <w:b/>
+          <w:sz w:val="28"/>
+          <w:szCs w:val="28"/>
+        </w:rPr>
+      </w:pPr>
+    </w:p>
+    <w:p>
+      <w:pPr>
+        <w:rPr>
+          <w:b/>
+          <w:sz w:val="28"/>
+          <w:szCs w:val="28"/>
+        </w:rPr>
+      </w:pPr>
+      <w:proofErr w:type="gramStart"/>
+      <w:r>
+        <w:rPr>
+          <w:b/>
+          <w:sz w:val="28"/>
+          <w:szCs w:val="28"/>
+        </w:rPr>
+        <w:lastRenderedPageBreak/>
+        <w:t>Weboldal(</w:t>
+      </w:r>
+      <w:proofErr w:type="gramEnd"/>
+      <w:r>
+        <w:rPr>
+          <w:b/>
+          <w:sz w:val="28"/>
+          <w:szCs w:val="28"/>
+        </w:rPr>
+        <w:t>2026.01.13. Home):</w:t>
+      </w:r>
+      <w:r>
+        <w:rPr>
+          <w:b/>
+          <w:noProof/>
+          <w:sz w:val="28"/>
+          <w:szCs w:val="28"/>
+        </w:rPr>
+        <w:drawing>
+          <wp:inline distT="0" distB="0" distL="0" distR="0">
+            <wp:extent cx="5753100" cy="2876550"/>
+            <wp:effectExtent l="0" t="0" r="0" b="0"/>
+            <wp:docPr id="6" name="Kép 6"/>
+            <wp:cNvGraphicFramePr>
+              <a:graphicFrameLocks xmlns:a="http://schemas.openxmlformats.org/drawingml/2006/main" noChangeAspect="1"/>
+            </wp:cNvGraphicFramePr>
+            <a:graphic xmlns:a="http://schemas.openxmlformats.org/drawingml/2006/main">
+              <a:graphicData uri="http://schemas.openxmlformats.org/drawingml/2006/picture">
+                <pic:pic xmlns:pic="http://schemas.openxmlformats.org/drawingml/2006/picture">
+                  <pic:nvPicPr>
+                    <pic:cNvPr id="0" name="Picture 1"/>
+                    <pic:cNvPicPr>
+                      <a:picLocks noChangeAspect="1" noChangeArrowheads="1"/>
+                    </pic:cNvPicPr>
+                  </pic:nvPicPr>
+                  <pic:blipFill>
+                    <a:blip r:embed="rId10" cstate="print">
+                      <a:extLst>
+                        <a:ext uri="{28A0092B-C50C-407E-A947-70E740481C1C}">
+                          <a14:useLocalDpi xmlns:a14="http://schemas.microsoft.com/office/drawing/2010/main" val="0"/>
+                        </a:ext>
+                      </a:extLst>
+                    </a:blip>
+                    <a:srcRect/>
+                    <a:stretch>
+                      <a:fillRect/>
+                    </a:stretch>
+                  </pic:blipFill>
+                  <pic:spPr bwMode="auto">
+                    <a:xfrm>
+                      <a:off x="0" y="0"/>
+                      <a:ext cx="5753100" cy="2876550"/>
+                    </a:xfrm>
+                    <a:prstGeom prst="rect">
+                      <a:avLst/>
+                    </a:prstGeom>
+                    <a:noFill/>
+                    <a:ln>
+                      <a:noFill/>
+                    </a:ln>
+                  </pic:spPr>
+                </pic:pic>
+              </a:graphicData>
+            </a:graphic>
+          </wp:inline>
+        </w:drawing>
+      </w:r>
+    </w:p>
+    <w:p>
+      <w:pPr>
+        <w:rPr>
+          <w:b/>
+          <w:sz w:val="28"/>
+          <w:szCs w:val="28"/>
+        </w:rPr>
+      </w:pPr>
+    </w:p>
+    <w:p>
+      <w:pPr>
+        <w:rPr>
+          <w:b/>
+          <w:sz w:val="28"/>
+          <w:szCs w:val="28"/>
+        </w:rPr>
+      </w:pPr>
+      <w:proofErr w:type="gramStart"/>
+      <w:r>
+        <w:rPr>
+          <w:b/>
+          <w:sz w:val="28"/>
+          <w:szCs w:val="28"/>
+        </w:rPr>
+        <w:t>Weboldal(</w:t>
+      </w:r>
+      <w:proofErr w:type="gramEnd"/>
+      <w:r>
+        <w:rPr>
+          <w:b/>
+          <w:sz w:val="28"/>
+          <w:szCs w:val="28"/>
+        </w:rPr>
+        <w:t>2026.01.13</w:t>
+      </w:r>
+      <w:r>
+        <w:rPr>
+          <w:b/>
+          <w:sz w:val="28"/>
+          <w:szCs w:val="28"/>
+        </w:rPr>
+        <w:t>. Meccsek</w:t>
+      </w:r>
+      <w:r>
+        <w:rPr>
+          <w:b/>
+          <w:sz w:val="28"/>
+          <w:szCs w:val="28"/>
+        </w:rPr>
+        <w:t>)</w:t>
+      </w:r>
+      <w:r>
+        <w:rPr>
+          <w:b/>
+          <w:sz w:val="28"/>
+          <w:szCs w:val="28"/>
+        </w:rPr>
+        <w:t xml:space="preserve"> </w:t>
+      </w:r>
+      <w:r>
+        <w:rPr>
+          <w:b/>
+          <w:sz w:val="28"/>
+          <w:szCs w:val="28"/>
+        </w:rPr>
+        <w:t>:</w:t>
+      </w:r>
+      <w:r>
+        <w:rPr>
+          <w:b/>
+          <w:noProof/>
+          <w:sz w:val="28"/>
+          <w:szCs w:val="28"/>
+        </w:rPr>
+        <w:drawing>
+          <wp:inline distT="0" distB="0" distL="0" distR="0">
+            <wp:extent cx="5743575" cy="2857500"/>
+            <wp:effectExtent l="0" t="0" r="9525" b="0"/>
+            <wp:docPr id="8" name="Kép 8"/>
+            <wp:cNvGraphicFramePr>
+              <a:graphicFrameLocks xmlns:a="http://schemas.openxmlformats.org/drawingml/2006/main" noChangeAspect="1"/>
+            </wp:cNvGraphicFramePr>
+            <a:graphic xmlns:a="http://schemas.openxmlformats.org/drawingml/2006/main">
+              <a:graphicData uri="http://schemas.openxmlformats.org/drawingml/2006/picture">
+                <pic:pic xmlns:pic="http://schemas.openxmlformats.org/drawingml/2006/picture">
+                  <pic:nvPicPr>
+                    <pic:cNvPr id="0" name="Picture 2"/>
+                    <pic:cNvPicPr>
+                      <a:picLocks noChangeAspect="1" noChangeArrowheads="1"/>
+                    </pic:cNvPicPr>
+                  </pic:nvPicPr>
+                  <pic:blipFill>
+                    <a:blip r:embed="rId11" cstate="print">
+                      <a:extLst>
+                        <a:ext uri="{28A0092B-C50C-407E-A947-70E740481C1C}">
+                          <a14:useLocalDpi xmlns:a14="http://schemas.microsoft.com/office/drawing/2010/main" val="0"/>
+                        </a:ext>
+                      </a:extLst>
+                    </a:blip>
+                    <a:srcRect/>
+                    <a:stretch>
+                      <a:fillRect/>
+                    </a:stretch>
+                  </pic:blipFill>
+                  <pic:spPr bwMode="auto">
+                    <a:xfrm>
+                      <a:off x="0" y="0"/>
+                      <a:ext cx="5743575" cy="2857500"/>
+                    </a:xfrm>
+                    <a:prstGeom prst="rect">
+                      <a:avLst/>
+                    </a:prstGeom>
+                    <a:noFill/>
+                    <a:ln>
+                      <a:noFill/>
+                    </a:ln>
+                  </pic:spPr>
+                </pic:pic>
+              </a:graphicData>
+            </a:graphic>
+          </wp:inline>
+        </w:drawing>
+      </w:r>
+      <w:r>
+        <w:rPr>
+          <w:b/>
+          <w:sz w:val="28"/>
+          <w:szCs w:val="28"/>
+        </w:rPr>
+        <w:br/>
+      </w:r>
+    </w:p>
+    <w:p>
+      <w:pPr>
+        <w:rPr>
+          <w:b/>
+          <w:sz w:val="28"/>
+          <w:szCs w:val="28"/>
+        </w:rPr>
+      </w:pPr>
+      <w:proofErr w:type="gramStart"/>
+      <w:r>
+        <w:rPr>
+          <w:b/>
+          <w:sz w:val="28"/>
+          <w:szCs w:val="28"/>
+        </w:rPr>
+        <w:lastRenderedPageBreak/>
+        <w:t>Weboldal(</w:t>
+      </w:r>
+      <w:proofErr w:type="gramEnd"/>
+      <w:r>
+        <w:rPr>
+          <w:b/>
+          <w:sz w:val="28"/>
+          <w:szCs w:val="28"/>
+        </w:rPr>
+        <w:t>2026.01.13.</w:t>
+      </w:r>
+      <w:r>
+        <w:rPr>
+          <w:b/>
+          <w:sz w:val="28"/>
+          <w:szCs w:val="28"/>
+        </w:rPr>
+        <w:t xml:space="preserve"> Eredmények</w:t>
+      </w:r>
+      <w:r>
+        <w:rPr>
+          <w:b/>
+          <w:sz w:val="28"/>
+          <w:szCs w:val="28"/>
+        </w:rPr>
+        <w:t>):</w:t>
+      </w:r>
+      <w:r>
+        <w:rPr>
+          <w:b/>
+          <w:noProof/>
+          <w:sz w:val="28"/>
+          <w:szCs w:val="28"/>
+        </w:rPr>
+        <w:drawing>
+          <wp:inline distT="0" distB="0" distL="0" distR="0">
+            <wp:extent cx="5753100" cy="2886075"/>
+            <wp:effectExtent l="0" t="0" r="0" b="9525"/>
+            <wp:docPr id="10" name="Kép 10"/>
+            <wp:cNvGraphicFramePr>
+              <a:graphicFrameLocks xmlns:a="http://schemas.openxmlformats.org/drawingml/2006/main" noChangeAspect="1"/>
+            </wp:cNvGraphicFramePr>
+            <a:graphic xmlns:a="http://schemas.openxmlformats.org/drawingml/2006/main">
+              <a:graphicData uri="http://schemas.openxmlformats.org/drawingml/2006/picture">
+                <pic:pic xmlns:pic="http://schemas.openxmlformats.org/drawingml/2006/picture">
+                  <pic:nvPicPr>
+                    <pic:cNvPr id="0" name="Picture 3"/>
+                    <pic:cNvPicPr>
+                      <a:picLocks noChangeAspect="1" noChangeArrowheads="1"/>
+                    </pic:cNvPicPr>
+                  </pic:nvPicPr>
+                  <pic:blipFill>
+                    <a:blip r:embed="rId12" cstate="print">
+                      <a:extLst>
+                        <a:ext uri="{28A0092B-C50C-407E-A947-70E740481C1C}">
+                          <a14:useLocalDpi xmlns:a14="http://schemas.microsoft.com/office/drawing/2010/main" val="0"/>
+                        </a:ext>
+                      </a:extLst>
+                    </a:blip>
+                    <a:srcRect/>
+                    <a:stretch>
+                      <a:fillRect/>
+                    </a:stretch>
+                  </pic:blipFill>
+                  <pic:spPr bwMode="auto">
+                    <a:xfrm>
+                      <a:off x="0" y="0"/>
+                      <a:ext cx="5753100" cy="2886075"/>
+                    </a:xfrm>
+                    <a:prstGeom prst="rect">
+                      <a:avLst/>
+                    </a:prstGeom>
+                    <a:noFill/>
+                    <a:ln>
+                      <a:noFill/>
+                    </a:ln>
+                  </pic:spPr>
+                </pic:pic>
+              </a:graphicData>
+            </a:graphic>
+          </wp:inline>
+        </w:drawing>
+      </w:r>
+    </w:p>
+    <w:p>
+      <w:pPr>
+        <w:rPr>
+          <w:b/>
+          <w:sz w:val="28"/>
+          <w:szCs w:val="28"/>
+        </w:rPr>
+      </w:pPr>
+    </w:p>
+    <w:p>
+      <w:pPr>
+        <w:rPr>
+          <w:b/>
+          <w:sz w:val="28"/>
+          <w:szCs w:val="28"/>
+        </w:rPr>
+      </w:pPr>
+      <w:proofErr w:type="gramStart"/>
+      <w:r>
+        <w:rPr>
+          <w:b/>
+          <w:sz w:val="28"/>
+          <w:szCs w:val="28"/>
+        </w:rPr>
+        <w:t>Weboldal(</w:t>
+      </w:r>
+      <w:proofErr w:type="gramEnd"/>
+      <w:r>
+        <w:rPr>
+          <w:b/>
+          <w:sz w:val="28"/>
+          <w:szCs w:val="28"/>
+        </w:rPr>
+        <w:t xml:space="preserve">2026.01.13. </w:t>
+      </w:r>
+      <w:proofErr w:type="spellStart"/>
+      <w:r>
+        <w:rPr>
+          <w:b/>
+          <w:sz w:val="28"/>
+          <w:szCs w:val="28"/>
+        </w:rPr>
+        <w:t>Összeállitások</w:t>
+      </w:r>
+      <w:proofErr w:type="spellEnd"/>
+      <w:r>
+        <w:rPr>
+          <w:b/>
+          <w:sz w:val="28"/>
+          <w:szCs w:val="28"/>
+        </w:rPr>
+        <w:t>):</w:t>
+      </w:r>
+    </w:p>
+    <w:p>
+      <w:pPr>
+        <w:rPr>
+          <w:b/>
+          <w:sz w:val="28"/>
+          <w:szCs w:val="28"/>
+        </w:rPr>
+      </w:pPr>
+      <w:r>
+        <w:rPr>
+          <w:b/>
+          <w:noProof/>
+          <w:sz w:val="28"/>
+          <w:szCs w:val="28"/>
+        </w:rPr>
+        <w:drawing>
+          <wp:inline distT="0" distB="0" distL="0" distR="0">
+            <wp:extent cx="5753100" cy="2867025"/>
+            <wp:effectExtent l="0" t="0" r="0" b="9525"/>
+            <wp:docPr id="11" name="Kép 11"/>
+            <wp:cNvGraphicFramePr>
+              <a:graphicFrameLocks xmlns:a="http://schemas.openxmlformats.org/drawingml/2006/main" noChangeAspect="1"/>
+            </wp:cNvGraphicFramePr>
+            <a:graphic xmlns:a="http://schemas.openxmlformats.org/drawingml/2006/main">
+              <a:graphicData uri="http://schemas.openxmlformats.org/drawingml/2006/picture">
+                <pic:pic xmlns:pic="http://schemas.openxmlformats.org/drawingml/2006/picture">
+                  <pic:nvPicPr>
+                    <pic:cNvPr id="0" name="Picture 4"/>
+                    <pic:cNvPicPr>
+                      <a:picLocks noChangeAspect="1" noChangeArrowheads="1"/>
+                    </pic:cNvPicPr>
+                  </pic:nvPicPr>
+                  <pic:blipFill>
+                    <a:blip r:embed="rId13" cstate="print">
+                      <a:extLst>
+                        <a:ext uri="{28A0092B-C50C-407E-A947-70E740481C1C}">
+                          <a14:useLocalDpi xmlns:a14="http://schemas.microsoft.com/office/drawing/2010/main" val="0"/>
+                        </a:ext>
+                      </a:extLst>
+                    </a:blip>
+                    <a:srcRect/>
+                    <a:stretch>
+                      <a:fillRect/>
+                    </a:stretch>
+                  </pic:blipFill>
+                  <pic:spPr bwMode="auto">
+                    <a:xfrm>
+                      <a:off x="0" y="0"/>
+                      <a:ext cx="5753100" cy="2867025"/>
+                    </a:xfrm>
+                    <a:prstGeom prst="rect">
+                      <a:avLst/>
+                    </a:prstGeom>
+                    <a:noFill/>
+                    <a:ln>
+                      <a:noFill/>
+                    </a:ln>
+                  </pic:spPr>
+                </pic:pic>
+              </a:graphicData>
+            </a:graphic>
+          </wp:inline>
+        </w:drawing>
+      </w:r>
+    </w:p>
+    <w:p>
+      <w:pPr>
+        <w:rPr>
+          <w:b/>
+          <w:sz w:val="28"/>
+          <w:szCs w:val="28"/>
+        </w:rPr>
+      </w:pPr>
+    </w:p>
+    <w:p>
+      <w:pPr>
+        <w:rPr>
+          <w:b/>
+          <w:sz w:val="28"/>
+          <w:szCs w:val="28"/>
+        </w:rPr>
+      </w:pPr>
+    </w:p>
+    <w:p>
+      <w:pPr>
+        <w:rPr>
+          <w:b/>
+          <w:sz w:val="28"/>
+          <w:szCs w:val="28"/>
+        </w:rPr>
+      </w:pPr>
+    </w:p>
+    <w:p>
+      <w:pPr>
+        <w:rPr>
+          <w:b/>
+          <w:sz w:val="28"/>
+          <w:szCs w:val="28"/>
+        </w:rPr>
+      </w:pPr>
+    </w:p>
+    <w:p>
+      <w:pPr>
+        <w:rPr>
+          <w:b/>
+          <w:sz w:val="28"/>
+          <w:szCs w:val="28"/>
+        </w:rPr>
+      </w:pPr>
+    </w:p>
+    <w:p>
+      <w:pPr>
+        <w:rPr>
+          <w:b/>
+          <w:sz w:val="28"/>
+          <w:szCs w:val="28"/>
+        </w:rPr>
+      </w:pPr>
+    </w:p>
+    <w:p>
+      <w:pPr>
+        <w:rPr>
+          <w:b/>
+          <w:sz w:val="28"/>
+          <w:szCs w:val="28"/>
+        </w:rPr>
+      </w:pPr>
+      <w:proofErr w:type="gramStart"/>
+      <w:r>
+        <w:rPr>
+          <w:b/>
+          <w:sz w:val="28"/>
+          <w:szCs w:val="28"/>
+        </w:rPr>
+        <w:lastRenderedPageBreak/>
+        <w:t>Weboldal(</w:t>
+      </w:r>
+      <w:proofErr w:type="gramEnd"/>
+      <w:r>
+        <w:rPr>
+          <w:b/>
+          <w:sz w:val="28"/>
+          <w:szCs w:val="28"/>
+        </w:rPr>
+        <w:t>2026.01.13. Hírek):</w:t>
+      </w:r>
+    </w:p>
+    <w:p>
+      <w:pPr>
+        <w:rPr>
+          <w:b/>
+          <w:sz w:val="28"/>
+          <w:szCs w:val="28"/>
+        </w:rPr>
+      </w:pPr>
+      <w:r>
+        <w:rPr>
+          <w:b/>
+          <w:noProof/>
+          <w:sz w:val="28"/>
+          <w:szCs w:val="28"/>
+        </w:rPr>
+        <w:drawing>
+          <wp:inline distT="0" distB="0" distL="0" distR="0">
+            <wp:extent cx="5743575" cy="2857500"/>
+            <wp:effectExtent l="0" t="0" r="9525" b="0"/>
+            <wp:docPr id="12" name="Kép 12"/>
+            <wp:cNvGraphicFramePr>
+              <a:graphicFrameLocks xmlns:a="http://schemas.openxmlformats.org/drawingml/2006/main" noChangeAspect="1"/>
+            </wp:cNvGraphicFramePr>
+            <a:graphic xmlns:a="http://schemas.openxmlformats.org/drawingml/2006/main">
+              <a:graphicData uri="http://schemas.openxmlformats.org/drawingml/2006/picture">
+                <pic:pic xmlns:pic="http://schemas.openxmlformats.org/drawingml/2006/picture">
+                  <pic:nvPicPr>
+                    <pic:cNvPr id="0" name="Picture 5"/>
+                    <pic:cNvPicPr>
+                      <a:picLocks noChangeAspect="1" noChangeArrowheads="1"/>
+                    </pic:cNvPicPr>
+                  </pic:nvPicPr>
+                  <pic:blipFill>
+                    <a:blip r:embed="rId14" cstate="print">
+                      <a:extLst>
+                        <a:ext uri="{28A0092B-C50C-407E-A947-70E740481C1C}">
+                          <a14:useLocalDpi xmlns:a14="http://schemas.microsoft.com/office/drawing/2010/main" val="0"/>
+                        </a:ext>
+                      </a:extLst>
+                    </a:blip>
+                    <a:srcRect/>
+                    <a:stretch>
+                      <a:fillRect/>
+                    </a:stretch>
+                  </pic:blipFill>
+                  <pic:spPr bwMode="auto">
+                    <a:xfrm>
+                      <a:off x="0" y="0"/>
+                      <a:ext cx="5743575" cy="2857500"/>
+                    </a:xfrm>
+                    <a:prstGeom prst="rect">
+                      <a:avLst/>
+                    </a:prstGeom>
+                    <a:noFill/>
+                    <a:ln>
+                      <a:noFill/>
+                    </a:ln>
+                  </pic:spPr>
+                </pic:pic>
+              </a:graphicData>
+            </a:graphic>
+          </wp:inline>
+        </w:drawing>
+      </w:r>
+    </w:p>
+    <w:p>
+      <w:pPr>
+        <w:rPr>
+          <w:b/>
+          <w:sz w:val="28"/>
+          <w:szCs w:val="28"/>
+        </w:rPr>
+      </w:pPr>
+    </w:p>
+    <w:p>
+      <w:pPr>
+        <w:rPr>
+          <w:b/>
+          <w:sz w:val="28"/>
+          <w:szCs w:val="28"/>
+        </w:rPr>
+      </w:pPr>
+      <w:proofErr w:type="gramStart"/>
+      <w:r>
+        <w:rPr>
+          <w:b/>
+          <w:sz w:val="28"/>
+          <w:szCs w:val="28"/>
+        </w:rPr>
+        <w:t>Weboldal(</w:t>
+      </w:r>
+      <w:proofErr w:type="gramEnd"/>
+      <w:r>
+        <w:rPr>
+          <w:b/>
+          <w:sz w:val="28"/>
+          <w:szCs w:val="28"/>
+        </w:rPr>
+        <w:t xml:space="preserve">2026.01.13. </w:t>
+      </w:r>
+      <w:proofErr w:type="spellStart"/>
+      <w:r>
+        <w:rPr>
+          <w:b/>
+          <w:sz w:val="28"/>
+          <w:szCs w:val="28"/>
+        </w:rPr>
+        <w:t>Rolúnk</w:t>
+      </w:r>
+      <w:proofErr w:type="spellEnd"/>
+      <w:r>
+        <w:rPr>
+          <w:b/>
+          <w:sz w:val="28"/>
+          <w:szCs w:val="28"/>
+        </w:rPr>
+        <w:t>):</w:t>
+      </w:r>
+    </w:p>
+    <w:p>
+      <w:pPr>
+        <w:rPr>
+          <w:b/>
+          <w:sz w:val="28"/>
+          <w:szCs w:val="28"/>
+        </w:rPr>
+      </w:pPr>
+      <w:bookmarkStart w:id="0" w:name="_GoBack"/>
+      <w:r>
+        <w:rPr>
+          <w:b/>
+          <w:noProof/>
+          <w:sz w:val="28"/>
+          <w:szCs w:val="28"/>
+        </w:rPr>
+        <w:drawing>
+          <wp:inline distT="0" distB="0" distL="0" distR="0">
+            <wp:extent cx="5743575" cy="2867025"/>
+            <wp:effectExtent l="0" t="0" r="9525" b="9525"/>
+            <wp:docPr id="13" name="Kép 13"/>
+            <wp:cNvGraphicFramePr>
+              <a:graphicFrameLocks xmlns:a="http://schemas.openxmlformats.org/drawingml/2006/main" noChangeAspect="1"/>
+            </wp:cNvGraphicFramePr>
+            <a:graphic xmlns:a="http://schemas.openxmlformats.org/drawingml/2006/main">
+              <a:graphicData uri="http://schemas.openxmlformats.org/drawingml/2006/picture">
+                <pic:pic xmlns:pic="http://schemas.openxmlformats.org/drawingml/2006/picture">
+                  <pic:nvPicPr>
+                    <pic:cNvPr id="0" name="Picture 6"/>
+                    <pic:cNvPicPr>
+                      <a:picLocks noChangeAspect="1" noChangeArrowheads="1"/>
+                    </pic:cNvPicPr>
+                  </pic:nvPicPr>
+                  <pic:blipFill>
+                    <a:blip r:embed="rId15" cstate="print">
+                      <a:extLst>
+                        <a:ext uri="{28A0092B-C50C-407E-A947-70E740481C1C}">
+                          <a14:useLocalDpi xmlns:a14="http://schemas.microsoft.com/office/drawing/2010/main" val="0"/>
+                        </a:ext>
+                      </a:extLst>
+                    </a:blip>
+                    <a:srcRect/>
+                    <a:stretch>
+                      <a:fillRect/>
+                    </a:stretch>
+                  </pic:blipFill>
+                  <pic:spPr bwMode="auto">
+                    <a:xfrm>
+                      <a:off x="0" y="0"/>
+                      <a:ext cx="5743575" cy="2867025"/>
+                    </a:xfrm>
+                    <a:prstGeom prst="rect">
+                      <a:avLst/>
+                    </a:prstGeom>
+                    <a:noFill/>
+                    <a:ln>
+                      <a:noFill/>
+                    </a:ln>
+                  </pic:spPr>
+                </pic:pic>
+              </a:graphicData>
+            </a:graphic>
+          </wp:inline>
+        </w:drawing>
+      </w:r>
+      <w:bookmarkEnd w:id="0"/>
     </w:p>
     <w:sectPr>
       <w:pgSz w:w="11906" w:h="16838"/>

</xml_diff>